<commit_message>
Add character progression and daily event workflow
</commit_message>
<xml_diff>
--- a/기본 술탄의 게임식 사무소 운영 시뮬.docx
+++ b/기본 술탄의 게임식 사무소 운영 시뮬.docx
@@ -86,11 +86,19 @@
     </w:p>
     <w:p/>
     <w:p>
-      <w:r>
-        <w:rPr>
-          <w:rFonts w:hint="eastAsia"/>
-        </w:rPr>
-        <w:t xml:space="preserve">게임진행 :매일 </w:t>
+      <w:proofErr w:type="gramStart"/>
+      <w:r>
+        <w:rPr>
+          <w:rFonts w:hint="eastAsia"/>
+        </w:rPr>
+        <w:t>게임진행 :매일</w:t>
+      </w:r>
+      <w:proofErr w:type="gramEnd"/>
+      <w:r>
+        <w:rPr>
+          <w:rFonts w:hint="eastAsia"/>
+        </w:rPr>
+        <w:t xml:space="preserve"> </w:t>
       </w:r>
       <w:proofErr w:type="spellStart"/>
       <w:r>
@@ -113,7 +121,21 @@
         <w:rPr>
           <w:rFonts w:hint="eastAsia"/>
         </w:rPr>
-        <w:t>카드의 종류 : 인물 장비 소비</w:t>
+        <w:t xml:space="preserve">카드의 </w:t>
+      </w:r>
+      <w:proofErr w:type="gramStart"/>
+      <w:r>
+        <w:rPr>
+          <w:rFonts w:hint="eastAsia"/>
+        </w:rPr>
+        <w:t>종류 :</w:t>
+      </w:r>
+      <w:proofErr w:type="gramEnd"/>
+      <w:r>
+        <w:rPr>
+          <w:rFonts w:hint="eastAsia"/>
+        </w:rPr>
+        <w:t xml:space="preserve"> 인물 장비 소비</w:t>
       </w:r>
     </w:p>
     <w:p/>
@@ -136,13 +158,27 @@
         <w:rPr>
           <w:rFonts w:hint="eastAsia"/>
         </w:rPr>
-        <w:t>(힘, 민첩, 지능, 매력), 스킬, 성장치,</w:t>
-      </w:r>
-      <w:r>
-        <w:rPr>
-          <w:rFonts w:hint="eastAsia"/>
-        </w:rPr>
-        <w:t>임금,</w:t>
+        <w:t xml:space="preserve">(힘, 민첩, 지능, 매력), 스킬, </w:t>
+      </w:r>
+      <w:proofErr w:type="gramStart"/>
+      <w:r>
+        <w:rPr>
+          <w:rFonts w:hint="eastAsia"/>
+        </w:rPr>
+        <w:t>성장치,</w:t>
+      </w:r>
+      <w:r>
+        <w:rPr>
+          <w:rFonts w:hint="eastAsia"/>
+        </w:rPr>
+        <w:t>임금</w:t>
+      </w:r>
+      <w:proofErr w:type="gramEnd"/>
+      <w:r>
+        <w:rPr>
+          <w:rFonts w:hint="eastAsia"/>
+        </w:rPr>
+        <w:t>,</w:t>
       </w:r>
       <w:r>
         <w:rPr>
@@ -176,7 +212,21 @@
         <w:rPr>
           <w:rFonts w:hint="eastAsia"/>
         </w:rPr>
-        <w:t xml:space="preserve"> 스킬 직업 을 가지고 있음</w:t>
+        <w:t xml:space="preserve"> 스킬 </w:t>
+      </w:r>
+      <w:proofErr w:type="gramStart"/>
+      <w:r>
+        <w:rPr>
+          <w:rFonts w:hint="eastAsia"/>
+        </w:rPr>
+        <w:t>직업 을</w:t>
+      </w:r>
+      <w:proofErr w:type="gramEnd"/>
+      <w:r>
+        <w:rPr>
+          <w:rFonts w:hint="eastAsia"/>
+        </w:rPr>
+        <w:t xml:space="preserve"> 가지고 있음</w:t>
       </w:r>
     </w:p>
     <w:p/>
@@ -283,7 +333,21 @@
         <w:rPr>
           <w:rFonts w:hint="eastAsia"/>
         </w:rPr>
-        <w:t>, 의뢰는 유효기간이 있으며, 일부 의뢰는 유효기간 만료 되어도 나중에 재발 가능하다.</w:t>
+        <w:t xml:space="preserve">, 의뢰는 유효기간이 있으며, 일부 의뢰는 유효기간 </w:t>
+      </w:r>
+      <w:proofErr w:type="gramStart"/>
+      <w:r>
+        <w:rPr>
+          <w:rFonts w:hint="eastAsia"/>
+        </w:rPr>
+        <w:t>만료 되어도</w:t>
+      </w:r>
+      <w:proofErr w:type="gramEnd"/>
+      <w:r>
+        <w:rPr>
+          <w:rFonts w:hint="eastAsia"/>
+        </w:rPr>
+        <w:t xml:space="preserve"> 나중에 재발 가능하다.</w:t>
       </w:r>
     </w:p>
     <w:p/>
@@ -293,16 +357,44 @@
           <w:rFonts w:hint="eastAsia"/>
         </w:rPr>
         <w:lastRenderedPageBreak/>
-        <w:t xml:space="preserve">스토리 의뢰: 스토리가 함께 엮여 있는 의뢰로 보통 의뢰 스토리 의뢰가 완료 되면 다음 스토리의뢰가 나오는 식 </w:t>
-      </w:r>
-    </w:p>
-    <w:p/>
-    <w:p>
-      <w:r>
-        <w:rPr>
-          <w:rFonts w:hint="eastAsia"/>
-        </w:rPr>
-        <w:t>일반 의뢰 : 매일 정기적으로 사무소에 들어오는 의뢰</w:t>
+        <w:t xml:space="preserve">스토리 의뢰: 스토리가 함께 엮여 있는 의뢰로 보통 의뢰 스토리 의뢰가 </w:t>
+      </w:r>
+      <w:proofErr w:type="gramStart"/>
+      <w:r>
+        <w:rPr>
+          <w:rFonts w:hint="eastAsia"/>
+        </w:rPr>
+        <w:t>완료 되면</w:t>
+      </w:r>
+      <w:proofErr w:type="gramEnd"/>
+      <w:r>
+        <w:rPr>
+          <w:rFonts w:hint="eastAsia"/>
+        </w:rPr>
+        <w:t xml:space="preserve"> 다음 스토리의뢰가 나오는 식 </w:t>
+      </w:r>
+    </w:p>
+    <w:p/>
+    <w:p>
+      <w:r>
+        <w:rPr>
+          <w:rFonts w:hint="eastAsia"/>
+        </w:rPr>
+        <w:t xml:space="preserve">일반 </w:t>
+      </w:r>
+      <w:proofErr w:type="gramStart"/>
+      <w:r>
+        <w:rPr>
+          <w:rFonts w:hint="eastAsia"/>
+        </w:rPr>
+        <w:t>의뢰 :</w:t>
+      </w:r>
+      <w:proofErr w:type="gramEnd"/>
+      <w:r>
+        <w:rPr>
+          <w:rFonts w:hint="eastAsia"/>
+        </w:rPr>
+        <w:t xml:space="preserve"> 매일 정기적으로 사무소에 들어오는 의뢰</w:t>
       </w:r>
       <w:r>
         <w:rPr>
@@ -331,7 +423,21 @@
         <w:rPr>
           <w:rFonts w:hint="eastAsia"/>
         </w:rPr>
-        <w:t xml:space="preserve"> 랜덤하게 발생하는 이벤트로 결과에 따라 다른 보상을 준다, 이벤트 의뢰는 수주하지 않을 시 재발 될 수 있으며, 만약 수주했을 경우 대부분의 경우 재발하지 않는다</w:t>
+        <w:t xml:space="preserve"> 랜덤하게 발생하는 이벤트로 결과에 따라 다른 보상을 준다, 이벤트 의뢰는 수주하지 않을 시 </w:t>
+      </w:r>
+      <w:proofErr w:type="gramStart"/>
+      <w:r>
+        <w:rPr>
+          <w:rFonts w:hint="eastAsia"/>
+        </w:rPr>
+        <w:t>재발 될</w:t>
+      </w:r>
+      <w:proofErr w:type="gramEnd"/>
+      <w:r>
+        <w:rPr>
+          <w:rFonts w:hint="eastAsia"/>
+        </w:rPr>
+        <w:t xml:space="preserve"> 수 있으며, 만약 수주했을 경우 대부분의 경우 재발하지 않는다</w:t>
       </w:r>
       <w:r>
         <w:br/>
@@ -449,7 +555,21 @@
         <w:rPr>
           <w:rFonts w:hint="eastAsia"/>
         </w:rPr>
-        <w:t xml:space="preserve"> 근력 성장치가 130인 대신에 다른 성장치가 낮다 그렇기에 자크의 성장치는 기본 130 에 전사의 근력 성장치인 90에 더해 220이다</w:t>
+        <w:t xml:space="preserve"> 근력 성장치가 130인 대신에 다른 성장치가 낮다 그렇기에 자크의 성장치는 기본 </w:t>
+      </w:r>
+      <w:proofErr w:type="gramStart"/>
+      <w:r>
+        <w:rPr>
+          <w:rFonts w:hint="eastAsia"/>
+        </w:rPr>
+        <w:t>130 에</w:t>
+      </w:r>
+      <w:proofErr w:type="gramEnd"/>
+      <w:r>
+        <w:rPr>
+          <w:rFonts w:hint="eastAsia"/>
+        </w:rPr>
+        <w:t xml:space="preserve"> 전사의 근력 성장치인 90에 더해 220이다</w:t>
       </w:r>
     </w:p>
     <w:p/>
@@ -463,11 +583,6 @@
     </w:p>
     <w:p/>
     <w:p>
-      <w:pPr>
-        <w:rPr>
-          <w:rFonts w:hint="eastAsia"/>
-        </w:rPr>
-      </w:pPr>
       <w:proofErr w:type="spellStart"/>
       <w:r>
         <w:rPr>
@@ -485,11 +600,6 @@
     </w:p>
     <w:p/>
     <w:p>
-      <w:pPr>
-        <w:rPr>
-          <w:rFonts w:hint="eastAsia"/>
-        </w:rPr>
-      </w:pPr>
       <w:proofErr w:type="spellStart"/>
       <w:r>
         <w:rPr>
@@ -526,11 +636,6 @@
       </w:r>
     </w:p>
     <w:p>
-      <w:pPr>
-        <w:rPr>
-          <w:rFonts w:hint="eastAsia"/>
-        </w:rPr>
-      </w:pPr>
       <w:proofErr w:type="spellStart"/>
       <w:r>
         <w:rPr>
@@ -591,7 +696,78 @@
         <w:rPr>
           <w:rFonts w:hint="eastAsia"/>
         </w:rPr>
-        <w:t xml:space="preserve">전사 </w:t>
+        <w:t>투사</w:t>
+      </w:r>
+    </w:p>
+    <w:p/>
+    <w:p>
+      <w:r>
+        <w:rPr>
+          <w:rFonts w:hint="eastAsia"/>
+        </w:rPr>
+        <w:t>사수</w:t>
+      </w:r>
+    </w:p>
+    <w:p/>
+    <w:p>
+      <w:r>
+        <w:rPr>
+          <w:rFonts w:hint="eastAsia"/>
+        </w:rPr>
+        <w:t>마법사</w:t>
+      </w:r>
+    </w:p>
+    <w:p/>
+    <w:p>
+      <w:r>
+        <w:rPr>
+          <w:rFonts w:hint="eastAsia"/>
+        </w:rPr>
+        <w:t>사제</w:t>
+      </w:r>
+    </w:p>
+    <w:p/>
+    <w:p>
+      <w:r>
+        <w:rPr>
+          <w:rFonts w:hint="eastAsia"/>
+        </w:rPr>
+        <w:t>첩자</w:t>
+      </w:r>
+    </w:p>
+    <w:p/>
+    <w:p>
+      <w:r>
+        <w:rPr>
+          <w:rFonts w:hint="eastAsia"/>
+        </w:rPr>
+        <w:t>재주꾼</w:t>
+      </w:r>
+    </w:p>
+    <w:p/>
+    <w:p>
+      <w:r>
+        <w:rPr>
+          <w:rFonts w:hint="eastAsia"/>
+        </w:rPr>
+        <w:t xml:space="preserve">위 6가지가 </w:t>
+      </w:r>
+      <w:proofErr w:type="spellStart"/>
+      <w:r>
+        <w:rPr>
+          <w:rFonts w:hint="eastAsia"/>
+        </w:rPr>
+        <w:t>기본직업이고</w:t>
+      </w:r>
+      <w:proofErr w:type="spellEnd"/>
+      <w:r>
+        <w:rPr>
+          <w:rFonts w:hint="eastAsia"/>
+        </w:rPr>
+        <w:t xml:space="preserve"> 여기서 상위 직업으로 전직 가능</w:t>
+      </w:r>
+      <w:r>
+        <w:tab/>
       </w:r>
     </w:p>
     <w:p/>
@@ -605,85 +781,21 @@
         <w:rPr>
           <w:rFonts w:hint="eastAsia"/>
         </w:rPr>
-        <w:t>궁수</w:t>
-      </w:r>
-    </w:p>
-    <w:p>
-      <w:pPr>
-        <w:rPr>
-          <w:rFonts w:hint="eastAsia"/>
-        </w:rPr>
-      </w:pPr>
-    </w:p>
-    <w:p>
-      <w:r>
-        <w:rPr>
-          <w:rFonts w:hint="eastAsia"/>
-        </w:rPr>
-        <w:t>마법사</w:t>
-      </w:r>
-    </w:p>
-    <w:p/>
-    <w:p>
-      <w:r>
-        <w:rPr>
-          <w:rFonts w:hint="eastAsia"/>
-        </w:rPr>
-        <w:t>성직자</w:t>
-      </w:r>
-    </w:p>
-    <w:p/>
-    <w:p>
-      <w:pPr>
-        <w:rPr>
-          <w:rFonts w:hint="eastAsia"/>
-        </w:rPr>
-      </w:pPr>
-      <w:r>
-        <w:rPr>
-          <w:rFonts w:hint="eastAsia"/>
-        </w:rPr>
-        <w:t>도적</w:t>
-      </w:r>
-    </w:p>
-    <w:p/>
-    <w:p>
-      <w:r>
-        <w:rPr>
-          <w:rFonts w:hint="eastAsia"/>
-        </w:rPr>
-        <w:t>재주꾼</w:t>
-      </w:r>
-    </w:p>
-    <w:p/>
-    <w:p>
-      <w:pPr>
-        <w:rPr>
-          <w:rFonts w:hint="eastAsia"/>
-        </w:rPr>
-      </w:pPr>
-      <w:r>
-        <w:rPr>
-          <w:rFonts w:hint="eastAsia"/>
-        </w:rPr>
-        <w:t xml:space="preserve">위 6가지가 </w:t>
-      </w:r>
-      <w:proofErr w:type="spellStart"/>
-      <w:r>
-        <w:rPr>
-          <w:rFonts w:hint="eastAsia"/>
-        </w:rPr>
-        <w:t>기본직업이고</w:t>
-      </w:r>
-      <w:proofErr w:type="spellEnd"/>
-      <w:r>
-        <w:rPr>
-          <w:rFonts w:hint="eastAsia"/>
-        </w:rPr>
-        <w:t xml:space="preserve"> 여기서 상위 직업으로 전직 가능</w:t>
-      </w:r>
-      <w:r>
-        <w:tab/>
+        <w:t xml:space="preserve">직업은 직업 레벨이 따로 존재하며 10레벨이 최고 레벨로 </w:t>
+      </w:r>
+      <w:proofErr w:type="spellStart"/>
+      <w:r>
+        <w:rPr>
+          <w:rFonts w:hint="eastAsia"/>
+        </w:rPr>
+        <w:t>만렙시</w:t>
+      </w:r>
+      <w:proofErr w:type="spellEnd"/>
+      <w:r>
+        <w:rPr>
+          <w:rFonts w:hint="eastAsia"/>
+        </w:rPr>
+        <w:t xml:space="preserve"> 조건을 충족하는 상위 직업으로 전직 가능, 여러가지 직업 가질 수 있으며 직업 레벨이 올라 습득한 스킬은 다른 직업으로도 사용 가능, 다만 성장치는 현재 직업이 가진 성장치 보너스만 받을 수 있으나 직업 레벨을 10레벨을 찍은 경우 다른 직업으로 바꿔도 성장치 보너스가 유지됨</w:t>
       </w:r>
     </w:p>
     <w:sectPr>

</xml_diff>